<commit_message>
Redact personal contact details
</commit_message>
<xml_diff>
--- a/docs/應用Machine Learning於公共物聯網.docx
+++ b/docs/應用Machine Learning於公共物聯網.docx
@@ -259,7 +259,7 @@
         <w:rPr>
           <w:rFonts w:ascii="Times New Roman" w:eastAsia="標楷體" w:hAnsi="Times New Roman" w:hint="eastAsia"/>
         </w:rPr>
-        <w:instrText>HYPERLINK "mailto:xixa3333@gmail.com"</w:instrText>
+        <w:instrText>                                     </w:instrText>
       </w:r>
       <w:r>
         <w:rPr>
@@ -277,7 +277,7 @@
           <w:rStyle w:val="a4"/>
           <w:rFonts w:ascii="Times New Roman" w:eastAsia="標楷體" w:hAnsi="Times New Roman" w:hint="eastAsia"/>
         </w:rPr>
-        <w:t>xixa3333@gmail.com</w:t>
+        <w:t>██████████████████</w:t>
       </w:r>
       <w:r>
         <w:rPr>
@@ -304,7 +304,7 @@
         <w:rPr>
           <w:rFonts w:ascii="Times New Roman" w:eastAsia="標楷體" w:hAnsi="Times New Roman" w:hint="eastAsia"/>
         </w:rPr>
-        <w:t>0989191610</w:t>
+        <w:t>██████████</w:t>
       </w:r>
     </w:p>
     <w:p>

</xml_diff>